<commit_message>
updated to new tasks.docx file
</commit_message>
<xml_diff>
--- a/tasks.docx
+++ b/tasks.docx
@@ -23,12 +23,13 @@
     <w:tbl>
       <w:tblPr>
         <w:tblStyle w:val="TableGrid"/>
-        <w:tblW w:w="9252" w:type="dxa"/>
+        <w:tblW w:w="8926" w:type="dxa"/>
         <w:tblLook w:val="04A0" w:firstRow="1" w:lastRow="0" w:firstColumn="1" w:lastColumn="0" w:noHBand="0" w:noVBand="1"/>
       </w:tblPr>
       <w:tblGrid>
         <w:gridCol w:w="3539"/>
-        <w:gridCol w:w="5713"/>
+        <w:gridCol w:w="4394"/>
+        <w:gridCol w:w="993"/>
       </w:tblGrid>
       <w:tr>
         <w:trPr>
@@ -63,9 +64,41 @@
         </w:tc>
         <w:tc>
           <w:tcPr>
-            <w:tcW w:w="5713" w:type="dxa"/>
+            <w:tcW w:w="4394" w:type="dxa"/>
           </w:tcPr>
           <w:p/>
+        </w:tc>
+        <w:tc>
+          <w:tcPr>
+            <w:tcW w:w="993" w:type="dxa"/>
+            <w:vMerge w:val="restart"/>
+          </w:tcPr>
+          <w:p>
+            <w:pPr>
+              <w:rPr>
+                <w:b/>
+                <w:bCs/>
+              </w:rPr>
+            </w:pPr>
+            <w:r>
+              <w:rPr>
+                <w:b/>
+                <w:bCs/>
+              </w:rPr>
+              <w:t>IDE</w:t>
+            </w:r>
+          </w:p>
+          <w:p>
+            <w:r>
+              <w:rPr>
+                <w:b/>
+                <w:bCs/>
+                <w:sz w:val="18"/>
+                <w:szCs w:val="18"/>
+              </w:rPr>
+              <w:t>(VS or Qt)</w:t>
+            </w:r>
+          </w:p>
         </w:tc>
       </w:tr>
       <w:tr>
@@ -101,7 +134,14 @@
         </w:tc>
         <w:tc>
           <w:tcPr>
-            <w:tcW w:w="5713" w:type="dxa"/>
+            <w:tcW w:w="4394" w:type="dxa"/>
+          </w:tcPr>
+          <w:p/>
+        </w:tc>
+        <w:tc>
+          <w:tcPr>
+            <w:tcW w:w="993" w:type="dxa"/>
+            <w:vMerge/>
           </w:tcPr>
           <w:p/>
         </w:tc>
@@ -132,7 +172,14 @@
         </w:tc>
         <w:tc>
           <w:tcPr>
-            <w:tcW w:w="5713" w:type="dxa"/>
+            <w:tcW w:w="4394" w:type="dxa"/>
+          </w:tcPr>
+          <w:p/>
+        </w:tc>
+        <w:tc>
+          <w:tcPr>
+            <w:tcW w:w="993" w:type="dxa"/>
+            <w:vMerge/>
           </w:tcPr>
           <w:p/>
         </w:tc>
@@ -144,21 +191,36 @@
           </w:tcPr>
           <w:p>
             <w:r>
-              <w:t xml:space="preserve">Task </w:t>
-            </w:r>
-            <w:r>
-              <w:t>A</w:t>
-            </w:r>
-            <w:r>
-              <w:t xml:space="preserve"> Complete? (Yes, No, Partially)</w:t>
-            </w:r>
-          </w:p>
-        </w:tc>
-        <w:tc>
-          <w:tcPr>
-            <w:tcW w:w="5713" w:type="dxa"/>
+              <w:t>Task A Complete? (Yes, No, Partially)</w:t>
+            </w:r>
+          </w:p>
+        </w:tc>
+        <w:tc>
+          <w:tcPr>
+            <w:tcW w:w="4394" w:type="dxa"/>
           </w:tcPr>
           <w:p/>
+        </w:tc>
+        <w:tc>
+          <w:tcPr>
+            <w:tcW w:w="993" w:type="dxa"/>
+          </w:tcPr>
+          <w:p>
+            <w:pPr>
+              <w:jc w:val="center"/>
+              <w:rPr>
+                <w:b/>
+                <w:bCs/>
+              </w:rPr>
+            </w:pPr>
+            <w:r>
+              <w:rPr>
+                <w:b/>
+                <w:bCs/>
+              </w:rPr>
+              <w:t>?</w:t>
+            </w:r>
+          </w:p>
         </w:tc>
       </w:tr>
       <w:tr>
@@ -168,21 +230,36 @@
           </w:tcPr>
           <w:p>
             <w:r>
-              <w:t xml:space="preserve">Task </w:t>
-            </w:r>
-            <w:r>
-              <w:t>B</w:t>
-            </w:r>
-            <w:r>
-              <w:t xml:space="preserve"> Complete? (Yes, No, Partially)</w:t>
-            </w:r>
-          </w:p>
-        </w:tc>
-        <w:tc>
-          <w:tcPr>
-            <w:tcW w:w="5713" w:type="dxa"/>
+              <w:t>Task B Complete? (Yes, No, Partially)</w:t>
+            </w:r>
+          </w:p>
+        </w:tc>
+        <w:tc>
+          <w:tcPr>
+            <w:tcW w:w="4394" w:type="dxa"/>
           </w:tcPr>
           <w:p/>
+        </w:tc>
+        <w:tc>
+          <w:tcPr>
+            <w:tcW w:w="993" w:type="dxa"/>
+          </w:tcPr>
+          <w:p>
+            <w:pPr>
+              <w:jc w:val="center"/>
+              <w:rPr>
+                <w:b/>
+                <w:bCs/>
+              </w:rPr>
+            </w:pPr>
+            <w:r>
+              <w:rPr>
+                <w:b/>
+                <w:bCs/>
+              </w:rPr>
+              <w:t>?</w:t>
+            </w:r>
+          </w:p>
         </w:tc>
       </w:tr>
       <w:tr>
@@ -192,21 +269,36 @@
           </w:tcPr>
           <w:p>
             <w:r>
-              <w:t xml:space="preserve">Task </w:t>
-            </w:r>
-            <w:r>
-              <w:t>C</w:t>
-            </w:r>
-            <w:r>
-              <w:t xml:space="preserve"> Complete? (Yes, No, Partially)</w:t>
-            </w:r>
-          </w:p>
-        </w:tc>
-        <w:tc>
-          <w:tcPr>
-            <w:tcW w:w="5713" w:type="dxa"/>
+              <w:t>Task C Complete? (Yes, No, Partially)</w:t>
+            </w:r>
+          </w:p>
+        </w:tc>
+        <w:tc>
+          <w:tcPr>
+            <w:tcW w:w="4394" w:type="dxa"/>
           </w:tcPr>
           <w:p/>
+        </w:tc>
+        <w:tc>
+          <w:tcPr>
+            <w:tcW w:w="993" w:type="dxa"/>
+          </w:tcPr>
+          <w:p>
+            <w:pPr>
+              <w:jc w:val="center"/>
+              <w:rPr>
+                <w:b/>
+                <w:bCs/>
+              </w:rPr>
+            </w:pPr>
+            <w:r>
+              <w:rPr>
+                <w:b/>
+                <w:bCs/>
+              </w:rPr>
+              <w:t>?</w:t>
+            </w:r>
+          </w:p>
         </w:tc>
       </w:tr>
       <w:tr>
@@ -225,9 +317,25 @@
         </w:tc>
         <w:tc>
           <w:tcPr>
-            <w:tcW w:w="5713" w:type="dxa"/>
+            <w:tcW w:w="4394" w:type="dxa"/>
           </w:tcPr>
           <w:p/>
+        </w:tc>
+        <w:tc>
+          <w:tcPr>
+            <w:tcW w:w="993" w:type="dxa"/>
+            <w:tcBorders>
+              <w:bottom w:val="single" w:sz="4" w:space="0" w:color="auto"/>
+            </w:tcBorders>
+          </w:tcPr>
+          <w:p>
+            <w:pPr>
+              <w:jc w:val="center"/>
+            </w:pPr>
+            <w:r>
+              <w:t>Qt</w:t>
+            </w:r>
+          </w:p>
         </w:tc>
       </w:tr>
       <w:tr>
@@ -240,16 +348,72 @@
           </w:tcPr>
           <w:p>
             <w:r>
-              <w:t>I have downloaded my code from the DLE into an empty folder, checked it is the right version, and that is all builds correctly</w:t>
-            </w:r>
-            <w:r>
-              <w:t>.</w:t>
-            </w:r>
-          </w:p>
-        </w:tc>
-        <w:tc>
-          <w:tcPr>
-            <w:tcW w:w="5713" w:type="dxa"/>
+              <w:t>I have downloaded my code from the DLE into an empty folder, checked it is the right version, and that is all builds correctly.</w:t>
+            </w:r>
+          </w:p>
+        </w:tc>
+        <w:tc>
+          <w:tcPr>
+            <w:tcW w:w="4394" w:type="dxa"/>
+            <w:tcBorders>
+              <w:right w:val="single" w:sz="4" w:space="0" w:color="auto"/>
+            </w:tcBorders>
+          </w:tcPr>
+          <w:p/>
+        </w:tc>
+        <w:tc>
+          <w:tcPr>
+            <w:tcW w:w="993" w:type="dxa"/>
+            <w:vMerge w:val="restart"/>
+            <w:tcBorders>
+              <w:top w:val="single" w:sz="4" w:space="0" w:color="auto"/>
+              <w:left w:val="single" w:sz="4" w:space="0" w:color="auto"/>
+              <w:bottom w:val="nil"/>
+              <w:right w:val="nil"/>
+            </w:tcBorders>
+          </w:tcPr>
+          <w:p/>
+        </w:tc>
+      </w:tr>
+      <w:tr>
+        <w:trPr>
+          <w:trHeight w:val="1130"/>
+        </w:trPr>
+        <w:tc>
+          <w:tcPr>
+            <w:tcW w:w="3539" w:type="dxa"/>
+          </w:tcPr>
+          <w:p>
+            <w:r>
+              <w:t xml:space="preserve">I have completed and submitted </w:t>
+            </w:r>
+            <w:r>
+              <w:rPr>
+                <w:rFonts w:ascii="Courier New" w:hAnsi="Courier New" w:cs="Courier New"/>
+              </w:rPr>
+              <w:t>COMP1000 C1 W2 Report Template.docx</w:t>
+            </w:r>
+          </w:p>
+        </w:tc>
+        <w:tc>
+          <w:tcPr>
+            <w:tcW w:w="4394" w:type="dxa"/>
+            <w:tcBorders>
+              <w:right w:val="single" w:sz="4" w:space="0" w:color="auto"/>
+            </w:tcBorders>
+          </w:tcPr>
+          <w:p/>
+        </w:tc>
+        <w:tc>
+          <w:tcPr>
+            <w:tcW w:w="993" w:type="dxa"/>
+            <w:vMerge/>
+            <w:tcBorders>
+              <w:top w:val="nil"/>
+              <w:left w:val="single" w:sz="4" w:space="0" w:color="auto"/>
+              <w:bottom w:val="nil"/>
+              <w:right w:val="nil"/>
+            </w:tcBorders>
           </w:tcPr>
           <w:p/>
         </w:tc>

</xml_diff>

<commit_message>
forgot about tasks doc
</commit_message>
<xml_diff>
--- a/tasks.docx
+++ b/tasks.docx
@@ -345,15 +345,7 @@
               <w:jc w:val="center"/>
             </w:pPr>
             <w:r>
-              <w:t xml:space="preserve">(Open </w:t>
-            </w:r>
-            <w:proofErr w:type="spellStart"/>
-            <w:r>
-              <w:t>CMake</w:t>
-            </w:r>
-            <w:proofErr w:type="spellEnd"/>
-            <w:r>
-              <w:t xml:space="preserve"> file in Application directory)</w:t>
+              <w:t>(Open CMake file in Application directory)</w:t>
             </w:r>
           </w:p>
         </w:tc>
@@ -379,7 +371,11 @@
               <w:right w:val="single" w:sz="4" w:space="0" w:color="auto"/>
             </w:tcBorders>
           </w:tcPr>
-          <w:p/>
+          <w:p>
+            <w:r>
+              <w:t>Yes</w:t>
+            </w:r>
+          </w:p>
         </w:tc>
         <w:tc>
           <w:tcPr>
@@ -422,7 +418,11 @@
               <w:right w:val="single" w:sz="4" w:space="0" w:color="auto"/>
             </w:tcBorders>
           </w:tcPr>
-          <w:p/>
+          <w:p>
+            <w:r>
+              <w:t>Yes</w:t>
+            </w:r>
+          </w:p>
         </w:tc>
         <w:tc>
           <w:tcPr>

</xml_diff>